<commit_message>
9/15 점검표 : Client 빌드 시각 17:18 로 갱신
Co-Authored-By: Claude Fable 5.1 <noreply@anthropic.com>
</commit_message>
<xml_diff>
--- a/docs/현장점검_20260915.docx
+++ b/docs/현장점검_20260915.docx
@@ -145,7 +145,7 @@
                 <w:sz w:val="19"/>
                 <w:szCs w:val="19"/>
               </w:rPr>
-              <w:t xml:space="preserve"> 09-12 17:06 (+ </w:t>
+              <w:t xml:space="preserve"> 09-12 17:18 (+ </w:t>
             </w:r>
             <w:r>
               <w:rPr>
@@ -3586,7 +3586,7 @@
           <w:sz w:val="16"/>
           <w:szCs w:val="16"/>
         </w:rPr>
-        <w:t xml:space="preserve">2026-09-12 17:15 작성 · 원본 docs\현장점검_20260912.md</w:t>
+        <w:t xml:space="preserve">2026-09-12 17:22 작성 · 원본 docs\현장점검_20260912.md</w:t>
       </w:r>
     </w:p>
     <w:sectPr>

</xml_diff>